<commit_message>
docs: sync resume content with live portfolio
</commit_message>
<xml_diff>
--- a/assets/resume.docx
+++ b/assets/resume.docx
@@ -199,12 +199,18 @@
     </w:p>
     <w:p>
       <w:r>
-        <w:t>Plaridel, Bulacan, Philippines · +63 917 501 5795</w:t>
-      </w:r>
-      <w:r>
-        <w:br/>
-      </w:r>
-      <w:hyperlink r:id="rId5" w:tgtFrame="_blank" w:history="1">
+        <w:t xml:space="preserve">Plaridel, Bulacan, Philippines </w:t>
+      </w:r>
+      <w:r>
+        <w:t>|</w:t>
+      </w:r>
+      <w:r>
+        <w:t xml:space="preserve"> +63 917 501 5795</w:t>
+      </w:r>
+      <w:r>
+        <w:t xml:space="preserve"> | </w:t>
+      </w:r>
+      <w:hyperlink r:id="rId5" w:history="1">
         <w:r>
           <w:rPr>
             <w:rStyle w:val="Hyperlink"/>
@@ -214,8 +220,21 @@
           <w:t>mark.cabelinga@pm.me</w:t>
         </w:r>
       </w:hyperlink>
-      <w:r>
-        <w:t> · </w:t>
+    </w:p>
+    <w:p>
+      <w:r>
+        <w:rPr>
+          <w:b/>
+          <w:bCs/>
+        </w:rPr>
+        <w:t>Portfolio: markjop.com |</w:t>
+      </w:r>
+      <w:r>
+        <w:rPr>
+          <w:b/>
+          <w:bCs/>
+        </w:rPr>
+        <w:t xml:space="preserve"> </w:t>
       </w:r>
       <w:r>
         <w:rPr>
@@ -244,7 +263,7 @@
     <w:p>
       <w:r>
         <w:pict w14:anchorId="5174FE8A">
-          <v:rect id="_x0000_i1049" style="width:0;height:.75pt" o:hralign="center" o:hrstd="t" o:hrnoshade="t" o:hr="t" fillcolor="#f8faff" stroked="f"/>
+          <v:rect id="_x0000_i1025" style="width:0;height:.75pt" o:hralign="center" o:hrstd="t" o:hrnoshade="t" o:hr="t" fillcolor="#f8faff" stroked="f"/>
         </w:pict>
       </w:r>
     </w:p>
@@ -319,7 +338,7 @@
     <w:p>
       <w:r>
         <w:pict w14:anchorId="1055CA74">
-          <v:rect id="_x0000_i1050" style="width:0;height:.75pt" o:hralign="center" o:hrstd="t" o:hrnoshade="t" o:hr="t" fillcolor="#f8faff" stroked="f"/>
+          <v:rect id="_x0000_i1026" style="width:0;height:.75pt" o:hralign="center" o:hrstd="t" o:hrnoshade="t" o:hr="t" fillcolor="#f8faff" stroked="f"/>
         </w:pict>
       </w:r>
     </w:p>
@@ -396,13 +415,18 @@
       </w:r>
       <w:r>
         <w:br/>
+      </w:r>
+      <w:r>
+        <w:t xml:space="preserve">IBM AI Fundamentals | </w:t>
+      </w:r>
+      <w:r>
         <w:t>ISTQB Certified Tester (CTFL) </w:t>
       </w:r>
     </w:p>
     <w:p>
       <w:r>
         <w:pict w14:anchorId="46448135">
-          <v:rect id="_x0000_i1051" style="width:0;height:.75pt" o:hralign="center" o:hrstd="t" o:hrnoshade="t" o:hr="t" fillcolor="#f8faff" stroked="f"/>
+          <v:rect id="_x0000_i1027" style="width:0;height:.75pt" o:hralign="center" o:hrstd="t" o:hrnoshade="t" o:hr="t" fillcolor="#f8faff" stroked="f"/>
         </w:pict>
       </w:r>
     </w:p>
@@ -948,7 +972,7 @@
     <w:p>
       <w:r>
         <w:pict w14:anchorId="4D1DA984">
-          <v:rect id="_x0000_i1052" style="width:0;height:.75pt" o:hralign="center" o:hrstd="t" o:hrnoshade="t" o:hr="t" fillcolor="#f8faff" stroked="f"/>
+          <v:rect id="_x0000_i1028" style="width:0;height:.75pt" o:hralign="center" o:hrstd="t" o:hrnoshade="t" o:hr="t" fillcolor="#f8faff" stroked="f"/>
         </w:pict>
       </w:r>
     </w:p>
@@ -965,6 +989,32 @@
           <w:bCs/>
         </w:rPr>
         <w:t>EDUCATION &amp; CERTIFICATIONS</w:t>
+      </w:r>
+    </w:p>
+    <w:p>
+      <w:pPr>
+        <w:numPr>
+          <w:ilvl w:val="0"/>
+          <w:numId w:val="6"/>
+        </w:numPr>
+      </w:pPr>
+      <w:r>
+        <w:rPr>
+          <w:b/>
+          <w:bCs/>
+        </w:rPr>
+        <w:t>IBM AI Fundamentals</w:t>
+      </w:r>
+      <w:r>
+        <w:t xml:space="preserve"> | </w:t>
+      </w:r>
+      <w:proofErr w:type="spellStart"/>
+      <w:r>
+        <w:t>Credly</w:t>
+      </w:r>
+      <w:proofErr w:type="spellEnd"/>
+      <w:r>
+        <w:t xml:space="preserve"> Certified | 2026</w:t>
       </w:r>
     </w:p>
     <w:p>

</xml_diff>